<commit_message>
paper: finalize major revision package and repository sync
</commit_message>
<xml_diff>
--- a/paper/revision_submission/response_to_reviewers_mc.docx
+++ b/paper/revision_submission/response_to_reviewers_mc.docx
@@ -2,13 +2,6 @@
 <file path=word/document.xml><?xml version="1.0" encoding="utf-8"?>
 <w:document xmlns:ns1="http://schemas.openxmlformats.org/officeDocument/2006/math" xmlns:w="http://schemas.openxmlformats.org/wordprocessingml/2006/main">
   <w:body>
-    <w:p>
-      <w:pPr>
-        <w:pStyle w:val="Title"/>
-        <w:jc w:val="left"/>
-        <w:spacing w:before="0" w:after="60"/>
-      </w:pPr>
-    </w:p>
     <w:p>
       <w:pPr>
         <w:jc w:val="center"/>
@@ -3282,7 +3275,7 @@
           <w:szCs w:val="20"/>
           <w:color w:val="000000"/>
         </w:rPr>
-        <w:t xml:space="preserve">Three new confirmed controller exports extend execution evidence to 480.7--629.7 MW (72.8--95.4% of nameplate). The original low-to-mid-load records are retained only as historian operating context and are not used to claim controller-internal execution. The new exports establish high-load controller execution, but they do not constitute a high-load pre/post causal-performance comparison, and the revision does not claim response improvement at every load. The matched-historian response claim and the controller-execution claim are kept separate.</w:t>
+        <w:t xml:space="preserve">Three new confirmed controller exports extend execution evidence to 480.7--629.7 MW (72.8--95.4% of nameplate). Together, the historian and controller records span measured operation from 195.7 to 629.7 MW (29.7--95.4% of nameplate), substantially extending the earlier 200--350 MW evidence. The original low-to-mid-load records are retained only as historian operating context and are not used to claim controller-internal execution. The new exports establish high-load controller execution, but they do not constitute a high-load pre/post causal-performance comparison. Because the available records do not provide continuous controller-internal validation at every load through 660 MW, the revision describes them as broad low-to-high-load operating evidence rather than complete full-range performance validation. The matched-historian response claim and the controller-execution claim are kept separate.</w:t>
       </w:r>
     </w:p>
     <w:p>
@@ -3499,6 +3492,9 @@
       </w:r>
       <ns1:oMath>
         <ns1:r>
+          <ns1:rPr>
+            <ns1:sty ns1:val="p"/>
+          </ns1:rPr>
           <w:rPr>
             <w:rFonts w:ascii="Times New Roman" w:hAnsi="Times New Roman" w:eastAsia="Times New Roman" w:cs="Times New Roman"/>
           </w:rPr>
@@ -3820,7 +3816,45 @@
           <w:szCs w:val="20"/>
           <w:color w:val="000000"/>
         </w:rPr>
-        <w:t xml:space="preserve">, uncertainty propagation through the HOCBF chain, and a plant-oriented commissioning/fallback procedure. The final primary table and numerical comparison are regenerated from the revised seven-state benchmark rather than carried over from the earlier five-state implementation.</w:t>
+        <w:t xml:space="preserve">, uncertainty propagation through the HOCBF chain, and a plant-oriented commissioning/fallback procedure. The requested comparison with GP mean correction without uncertainty propagation is now explicit. The tune-selected mean-only endpoint (</w:t>
+      </w:r>
+      <w:r>
+        <w:rPr>
+          <w:rFonts w:ascii="Times New Roman" w:hAnsi="Times New Roman" w:eastAsia="Times New Roman" w:cs="Times New Roman"/>
+          <w:rStyle w:val="VerbatimChar"/>
+          <w:sz w:val="20"/>
+          <w:szCs w:val="20"/>
+          <w:color w:val="000000"/>
+        </w:rPr>
+        <w:t xml:space="preserve">epsilon_kappa = 0</w:t>
+      </w:r>
+      <w:r>
+        <w:rPr>
+          <w:rFonts w:ascii="Times New Roman" w:hAnsi="Times New Roman" w:eastAsia="Times New Roman" w:cs="Times New Roman"/>
+          <w:sz w:val="20"/>
+          <w:szCs w:val="20"/>
+          <w:color w:val="000000"/>
+        </w:rPr>
+        <w:t xml:space="preserve">) records 0/175,000 observed violations in the primary sweep. By contrast, the full implemented-margin endpoint (</w:t>
+      </w:r>
+      <w:r>
+        <w:rPr>
+          <w:rFonts w:ascii="Times New Roman" w:hAnsi="Times New Roman" w:eastAsia="Times New Roman" w:cs="Times New Roman"/>
+          <w:rStyle w:val="VerbatimChar"/>
+          <w:sz w:val="20"/>
+          <w:szCs w:val="20"/>
+          <w:color w:val="000000"/>
+        </w:rPr>
+        <w:t xml:space="preserve">epsilon_kappa = 1</w:t>
+      </w:r>
+      <w:r>
+        <w:rPr>
+          <w:rFonts w:ascii="Times New Roman" w:hAnsi="Times New Roman" w:eastAsia="Times New Roman" w:cs="Times New Roman"/>
+          <w:sz w:val="20"/>
+          <w:szCs w:val="20"/>
+          <w:color w:val="000000"/>
+        </w:rPr>
+        <w:t xml:space="preserve">) rejects 149,800/150,000 QPs across the six mismatch conditions and consequently reproduces the no-GP count of 65,134/150,000 violating samples. Supplemental Table S2 also reports the intermediate margin candidates used by the tune/test selector. These results do not show that stronger uncertainty tightening is generically safer; they show why the compositional margin must be exposed to feasibility-aware commissioning rather than applied mechanically. The final primary table and numerical comparison are regenerated from the revised seven-state benchmark rather than carried over from the earlier five-state implementation.</w:t>
       </w:r>
     </w:p>
     <w:p>
@@ -3856,7 +3890,7 @@
           <w:szCs w:val="20"/>
           <w:color w:val="000000"/>
         </w:rPr>
-        <w:t xml:space="preserve">Sections 1.3 and 1.4; Sections 2.2--2.4; Sections 3.2 and 3.3; Section 4.2, Table 2.</w:t>
+        <w:t xml:space="preserve">Sections 1.3 and 1.4; Sections 2.2--2.4; Sections 3.2 and 3.3; Section 4.2, Tables 2 and 3; Supplemental Section S2, Table S2.</w:t>
       </w:r>
     </w:p>
     <w:p>
@@ -5234,7 +5268,7 @@
       <w:lvlText w:val=" "/>
       <w:lvlJc w:val="left"/>
       <w:pPr>
-        <w:ind w:left="720" w:hanging="480"/>
+        <w:ind w:left="720" w:hanging="360"/>
       </w:pPr>
       <w:rPr>
         <w:rFonts w:ascii="Times New Roman" w:hAnsi="Times New Roman" w:eastAsia="Times New Roman" w:cs="Times New Roman"/>
@@ -5245,7 +5279,7 @@
       <w:lvlText w:val=" "/>
       <w:lvlJc w:val="left"/>
       <w:pPr>
-        <w:ind w:left="1440" w:hanging="480"/>
+        <w:ind w:left="1440" w:hanging="360"/>
       </w:pPr>
       <w:rPr>
         <w:rFonts w:ascii="Times New Roman" w:hAnsi="Times New Roman" w:eastAsia="Times New Roman" w:cs="Times New Roman"/>
@@ -5256,7 +5290,7 @@
       <w:lvlText w:val=" "/>
       <w:lvlJc w:val="left"/>
       <w:pPr>
-        <w:ind w:left="2160" w:hanging="480"/>
+        <w:ind w:left="2160" w:hanging="360"/>
       </w:pPr>
       <w:rPr>
         <w:rFonts w:ascii="Times New Roman" w:hAnsi="Times New Roman" w:eastAsia="Times New Roman" w:cs="Times New Roman"/>
@@ -5267,7 +5301,7 @@
       <w:lvlText w:val=" "/>
       <w:lvlJc w:val="left"/>
       <w:pPr>
-        <w:ind w:left="2880" w:hanging="480"/>
+        <w:ind w:left="2880" w:hanging="360"/>
       </w:pPr>
       <w:rPr>
         <w:rFonts w:ascii="Times New Roman" w:hAnsi="Times New Roman" w:eastAsia="Times New Roman" w:cs="Times New Roman"/>
@@ -5278,7 +5312,7 @@
       <w:lvlText w:val=" "/>
       <w:lvlJc w:val="left"/>
       <w:pPr>
-        <w:ind w:left="3600" w:hanging="480"/>
+        <w:ind w:left="3600" w:hanging="360"/>
       </w:pPr>
       <w:rPr>
         <w:rFonts w:ascii="Times New Roman" w:hAnsi="Times New Roman" w:eastAsia="Times New Roman" w:cs="Times New Roman"/>
@@ -5289,7 +5323,7 @@
       <w:lvlText w:val=" "/>
       <w:lvlJc w:val="left"/>
       <w:pPr>
-        <w:ind w:left="4320" w:hanging="480"/>
+        <w:ind w:left="4320" w:hanging="360"/>
       </w:pPr>
       <w:rPr>
         <w:rFonts w:ascii="Times New Roman" w:hAnsi="Times New Roman" w:eastAsia="Times New Roman" w:cs="Times New Roman"/>
@@ -5300,7 +5334,7 @@
       <w:lvlText w:val=" "/>
       <w:lvlJc w:val="left"/>
       <w:pPr>
-        <w:ind w:left="5040" w:hanging="480"/>
+        <w:ind w:left="5040" w:hanging="360"/>
       </w:pPr>
       <w:rPr>
         <w:rFonts w:ascii="Times New Roman" w:hAnsi="Times New Roman" w:eastAsia="Times New Roman" w:cs="Times New Roman"/>
@@ -5311,7 +5345,7 @@
       <w:lvlText w:val=" "/>
       <w:lvlJc w:val="left"/>
       <w:pPr>
-        <w:ind w:left="5760" w:hanging="480"/>
+        <w:ind w:left="5760" w:hanging="360"/>
       </w:pPr>
       <w:rPr>
         <w:rFonts w:ascii="Times New Roman" w:hAnsi="Times New Roman" w:eastAsia="Times New Roman" w:cs="Times New Roman"/>
@@ -5322,7 +5356,7 @@
       <w:lvlText w:val=" "/>
       <w:lvlJc w:val="left"/>
       <w:pPr>
-        <w:ind w:left="6480" w:hanging="480"/>
+        <w:ind w:left="6480" w:hanging="360"/>
       </w:pPr>
       <w:rPr>
         <w:rFonts w:ascii="Times New Roman" w:hAnsi="Times New Roman" w:eastAsia="Times New Roman" w:cs="Times New Roman"/>
@@ -5338,7 +5372,7 @@
       <w:lvlText w:val="%1."/>
       <w:lvlJc w:val="left"/>
       <w:pPr>
-        <w:ind w:left="720" w:hanging="480"/>
+        <w:ind w:left="720" w:hanging="360"/>
       </w:pPr>
       <w:rPr>
         <w:rFonts w:ascii="Times New Roman" w:hAnsi="Times New Roman" w:eastAsia="Times New Roman" w:cs="Times New Roman"/>
@@ -5350,7 +5384,7 @@
       <w:lvlText w:val="%2."/>
       <w:lvlJc w:val="left"/>
       <w:pPr>
-        <w:ind w:left="1440" w:hanging="480"/>
+        <w:ind w:left="1440" w:hanging="360"/>
       </w:pPr>
       <w:rPr>
         <w:rFonts w:ascii="Times New Roman" w:hAnsi="Times New Roman" w:eastAsia="Times New Roman" w:cs="Times New Roman"/>
@@ -5362,7 +5396,7 @@
       <w:lvlText w:val="%3."/>
       <w:lvlJc w:val="left"/>
       <w:pPr>
-        <w:ind w:left="2160" w:hanging="480"/>
+        <w:ind w:left="2160" w:hanging="360"/>
       </w:pPr>
       <w:rPr>
         <w:rFonts w:ascii="Times New Roman" w:hAnsi="Times New Roman" w:eastAsia="Times New Roman" w:cs="Times New Roman"/>
@@ -5374,7 +5408,7 @@
       <w:lvlText w:val="%4."/>
       <w:lvlJc w:val="left"/>
       <w:pPr>
-        <w:ind w:left="2880" w:hanging="480"/>
+        <w:ind w:left="2880" w:hanging="360"/>
       </w:pPr>
       <w:rPr>
         <w:rFonts w:ascii="Times New Roman" w:hAnsi="Times New Roman" w:eastAsia="Times New Roman" w:cs="Times New Roman"/>
@@ -5386,7 +5420,7 @@
       <w:lvlText w:val="%5."/>
       <w:lvlJc w:val="left"/>
       <w:pPr>
-        <w:ind w:left="3600" w:hanging="480"/>
+        <w:ind w:left="3600" w:hanging="360"/>
       </w:pPr>
       <w:rPr>
         <w:rFonts w:ascii="Times New Roman" w:hAnsi="Times New Roman" w:eastAsia="Times New Roman" w:cs="Times New Roman"/>
@@ -5398,7 +5432,7 @@
       <w:lvlText w:val="%6."/>
       <w:lvlJc w:val="left"/>
       <w:pPr>
-        <w:ind w:left="4320" w:hanging="480"/>
+        <w:ind w:left="4320" w:hanging="360"/>
       </w:pPr>
       <w:rPr>
         <w:rFonts w:ascii="Times New Roman" w:hAnsi="Times New Roman" w:eastAsia="Times New Roman" w:cs="Times New Roman"/>
@@ -5410,7 +5444,7 @@
       <w:lvlText w:val="%7."/>
       <w:lvlJc w:val="left"/>
       <w:pPr>
-        <w:ind w:left="5040" w:hanging="480"/>
+        <w:ind w:left="5040" w:hanging="360"/>
       </w:pPr>
       <w:rPr>
         <w:rFonts w:ascii="Times New Roman" w:hAnsi="Times New Roman" w:eastAsia="Times New Roman" w:cs="Times New Roman"/>
@@ -5422,7 +5456,7 @@
       <w:lvlText w:val="%8."/>
       <w:lvlJc w:val="left"/>
       <w:pPr>
-        <w:ind w:left="5760" w:hanging="480"/>
+        <w:ind w:left="5760" w:hanging="360"/>
       </w:pPr>
       <w:rPr>
         <w:rFonts w:ascii="Times New Roman" w:hAnsi="Times New Roman" w:eastAsia="Times New Roman" w:cs="Times New Roman"/>
@@ -5434,7 +5468,7 @@
       <w:lvlText w:val="%9."/>
       <w:lvlJc w:val="left"/>
       <w:pPr>
-        <w:ind w:left="6480" w:hanging="480"/>
+        <w:ind w:left="6480" w:hanging="360"/>
       </w:pPr>
       <w:rPr>
         <w:rFonts w:ascii="Times New Roman" w:hAnsi="Times New Roman" w:eastAsia="Times New Roman" w:cs="Times New Roman"/>

</xml_diff>